<commit_message>
Pay the remaining one-loop QED IOUs and ship the complete book as a single readable file.
Rewrite Lessons 75-86 with derived g=2, F2(0), Lamb, Uehling, the correct Schwinger prefactor, and a static hyperlinked TOC, copyright page, and bibliography.

Co-authored-by: Cursor <cursoragent@cursor.com>
</commit_message>
<xml_diff>
--- a/Science Books/QED Course/Lesson 39 Deriving the Electromagnetic Interaction.docx
+++ b/Science Books/QED Course/Lesson 39 Deriving the Electromagnetic Interaction.docx
@@ -58,7 +58,7 @@
     </w:p>
     <w:p>
       <w:pPr>
-        <w:pStyle w:val="Heading1"/>
+        <w:pStyle w:val="Heading2"/>
       </w:pPr>
       <w:r>
         <w:t>How to use this lesson</w:t>
@@ -76,7 +76,7 @@
     </w:p>
     <w:p>
       <w:pPr>
-        <w:pStyle w:val="Heading2"/>
+        <w:pStyle w:val="Heading3"/>
       </w:pPr>
       <w:r>
         <w:t>Learning objectives</w:t>
@@ -148,7 +148,7 @@
     </w:p>
     <w:p>
       <w:pPr>
-        <w:pStyle w:val="Heading2"/>
+        <w:pStyle w:val="Heading3"/>
       </w:pPr>
       <w:r>
         <w:t>Notation and conventions</w:t>
@@ -474,7 +474,7 @@
     </w:tbl>
     <w:p>
       <w:pPr>
-        <w:pStyle w:val="Heading1"/>
+        <w:pStyle w:val="Heading2"/>
       </w:pPr>
       <w:r>
         <w:t>1 Assembling the gauge-invariant Dirac Lagrangian</w:t>
@@ -482,7 +482,7 @@
     </w:p>
     <w:p>
       <w:pPr>
-        <w:pStyle w:val="Heading2"/>
+        <w:pStyle w:val="Heading3"/>
       </w:pPr>
       <w:r>
         <w:t>1.1 From the general result to the Dirac case</w:t>
@@ -501,8 +501,102 @@
       <m:oMathPara>
         <m:oMath>
           <m:r>
-            <m:t xml:space="preserve">ℒ = ψ̄ ( iγ^μD_μ − m ) ψ = ψ̄ ( iγ^μ∂_μ − m ) ψ − q ψ̄γ^μψ A_μ</m:t>
+            <m:t xml:space="preserve">ℒ</m:t>
           </m:r>
+          <m:r>
+            <m:t xml:space="preserve">=</m:t>
+          </m:r>
+          <m:r>
+            <m:t xml:space="preserve">ψ̄</m:t>
+          </m:r>
+          <m:sSubSup>
+            <m:e>
+              <m:r>
+                <m:t xml:space="preserve">iγ</m:t>
+              </m:r>
+            </m:e>
+            <m:sub>
+              <m:r>
+                <m:t xml:space="preserve">μ</m:t>
+              </m:r>
+            </m:sub>
+            <m:sup>
+              <m:r>
+                <m:t xml:space="preserve">μD</m:t>
+              </m:r>
+            </m:sup>
+          </m:sSubSup>
+          <m:r>
+            <m:t xml:space="preserve">−</m:t>
+          </m:r>
+          <m:r>
+            <m:t xml:space="preserve">m</m:t>
+          </m:r>
+          <m:r>
+            <m:t xml:space="preserve">ψ</m:t>
+          </m:r>
+          <m:r>
+            <m:t xml:space="preserve">=</m:t>
+          </m:r>
+          <m:r>
+            <m:t xml:space="preserve">ψ̄</m:t>
+          </m:r>
+          <m:sSubSup>
+            <m:e>
+              <m:r>
+                <m:t xml:space="preserve">iγ</m:t>
+              </m:r>
+            </m:e>
+            <m:sub>
+              <m:r>
+                <m:t xml:space="preserve">μ</m:t>
+              </m:r>
+            </m:sub>
+            <m:sup>
+              <m:r>
+                <m:t xml:space="preserve">μ∂</m:t>
+              </m:r>
+            </m:sup>
+          </m:sSubSup>
+          <m:r>
+            <m:t xml:space="preserve">−</m:t>
+          </m:r>
+          <m:r>
+            <m:t xml:space="preserve">m</m:t>
+          </m:r>
+          <m:r>
+            <m:t xml:space="preserve">ψ</m:t>
+          </m:r>
+          <m:r>
+            <m:t xml:space="preserve">−</m:t>
+          </m:r>
+          <m:r>
+            <m:t xml:space="preserve">q</m:t>
+          </m:r>
+          <m:sSup>
+            <m:e>
+              <m:r>
+                <m:t xml:space="preserve">ψ̄γ</m:t>
+              </m:r>
+            </m:e>
+            <m:sup>
+              <m:r>
+                <m:t xml:space="preserve">μψ</m:t>
+              </m:r>
+            </m:sup>
+          </m:sSup>
+          <m:sSub>
+            <m:e>
+              <m:r>
+                <m:t xml:space="preserve">A</m:t>
+              </m:r>
+            </m:e>
+            <m:sub>
+              <m:r>
+                <m:t xml:space="preserve">μ</m:t>
+              </m:r>
+            </m:sub>
+          </m:sSub>
         </m:oMath>
       </m:oMathPara>
     </w:p>
@@ -513,7 +607,7 @@
     </w:p>
     <w:p>
       <w:pPr>
-        <w:pStyle w:val="Heading2"/>
+        <w:pStyle w:val="Heading3"/>
       </w:pPr>
       <w:r>
         <w:t>1.2 Expanding D_μ</w:t>
@@ -531,9 +625,113 @@
       </w:pPr>
       <m:oMathPara>
         <m:oMath>
+          <m:sSubSup>
+            <m:e>
+              <m:r>
+                <m:t xml:space="preserve">ψ̄iγ</m:t>
+              </m:r>
+            </m:e>
+            <m:sub>
+              <m:r>
+                <m:t xml:space="preserve">μψ</m:t>
+              </m:r>
+            </m:sub>
+            <m:sup>
+              <m:r>
+                <m:t xml:space="preserve">μD</m:t>
+              </m:r>
+            </m:sup>
+          </m:sSubSup>
           <m:r>
-            <m:t xml:space="preserve">ψ̄iγ^μD_μψ = ψ̄iγ^μ∂_μψ + ψ̄iγ^μ(iqA_μ)ψ = ψ̄iγ^μ∂_μψ − qψ̄γ^μψA_μ</m:t>
+            <m:t xml:space="preserve">=</m:t>
           </m:r>
+          <m:sSubSup>
+            <m:e>
+              <m:r>
+                <m:t xml:space="preserve">ψ̄iγ</m:t>
+              </m:r>
+            </m:e>
+            <m:sub>
+              <m:r>
+                <m:t xml:space="preserve">μψ</m:t>
+              </m:r>
+            </m:sub>
+            <m:sup>
+              <m:r>
+                <m:t xml:space="preserve">μ∂</m:t>
+              </m:r>
+            </m:sup>
+          </m:sSubSup>
+          <m:r>
+            <m:t xml:space="preserve">+</m:t>
+          </m:r>
+          <m:sSup>
+            <m:e>
+              <m:r>
+                <m:t xml:space="preserve">ψ̄iγ</m:t>
+              </m:r>
+            </m:e>
+            <m:sup>
+              <m:r>
+                <m:t xml:space="preserve">μ</m:t>
+              </m:r>
+            </m:sup>
+          </m:sSup>
+          <m:sSub>
+            <m:e>
+              <m:r>
+                <m:t xml:space="preserve">iqA</m:t>
+              </m:r>
+            </m:e>
+            <m:sub>
+              <m:r>
+                <m:t xml:space="preserve">μ</m:t>
+              </m:r>
+            </m:sub>
+          </m:sSub>
+          <m:r>
+            <m:t xml:space="preserve">ψ</m:t>
+          </m:r>
+          <m:r>
+            <m:t xml:space="preserve">=</m:t>
+          </m:r>
+          <m:sSubSup>
+            <m:e>
+              <m:r>
+                <m:t xml:space="preserve">ψ̄iγ</m:t>
+              </m:r>
+            </m:e>
+            <m:sub>
+              <m:r>
+                <m:t xml:space="preserve">μψ</m:t>
+              </m:r>
+            </m:sub>
+            <m:sup>
+              <m:r>
+                <m:t xml:space="preserve">μ∂</m:t>
+              </m:r>
+            </m:sup>
+          </m:sSubSup>
+          <m:r>
+            <m:t xml:space="preserve">−</m:t>
+          </m:r>
+          <m:sSubSup>
+            <m:e>
+              <m:r>
+                <m:t xml:space="preserve">qψ̄γ</m:t>
+              </m:r>
+            </m:e>
+            <m:sub>
+              <m:r>
+                <m:t xml:space="preserve">μ</m:t>
+              </m:r>
+            </m:sub>
+            <m:sup>
+              <m:r>
+                <m:t xml:space="preserve">μψA</m:t>
+              </m:r>
+            </m:sup>
+          </m:sSubSup>
         </m:oMath>
       </m:oMathPara>
     </w:p>
@@ -543,10 +741,11 @@
       </w:r>
     </w:p>
     <w:p>
-      <w:pPr>
-        <w:pStyle w:val="Heading3"/>
-      </w:pPr>
       <w:r>
+        <w:rPr>
+          <w:b/>
+          <w:i/>
+        </w:rPr>
         <w:t>Worked example 1</w:t>
       </w:r>
     </w:p>
@@ -557,7 +756,7 @@
     </w:p>
     <w:p>
       <w:pPr>
-        <w:pStyle w:val="Heading1"/>
+        <w:pStyle w:val="Heading2"/>
       </w:pPr>
       <w:r>
         <w:t>2 The interaction term</w:t>
@@ -565,7 +764,7 @@
     </w:p>
     <w:p>
       <w:pPr>
-        <w:pStyle w:val="Heading2"/>
+        <w:pStyle w:val="Heading3"/>
       </w:pPr>
       <w:r>
         <w:t>2.1 Identification</w:t>
@@ -578,9 +777,81 @@
       </w:pPr>
       <m:oMathPara>
         <m:oMath>
+          <m:sSub>
+            <m:e>
+              <m:r>
+                <m:t xml:space="preserve">ℒ</m:t>
+              </m:r>
+            </m:e>
+            <m:sub>
+              <m:r>
+                <m:t xml:space="preserve">int</m:t>
+              </m:r>
+            </m:sub>
+          </m:sSub>
           <m:r>
-            <m:t xml:space="preserve">ℒ_int = − q ψ̄γ^μψ A_μ = − j^μ A_μ</m:t>
+            <m:t xml:space="preserve">=</m:t>
           </m:r>
+          <m:r>
+            <m:t xml:space="preserve">−</m:t>
+          </m:r>
+          <m:r>
+            <m:t xml:space="preserve">q</m:t>
+          </m:r>
+          <m:sSup>
+            <m:e>
+              <m:r>
+                <m:t xml:space="preserve">ψ̄γ</m:t>
+              </m:r>
+            </m:e>
+            <m:sup>
+              <m:r>
+                <m:t xml:space="preserve">μψ</m:t>
+              </m:r>
+            </m:sup>
+          </m:sSup>
+          <m:sSub>
+            <m:e>
+              <m:r>
+                <m:t xml:space="preserve">A</m:t>
+              </m:r>
+            </m:e>
+            <m:sub>
+              <m:r>
+                <m:t xml:space="preserve">μ</m:t>
+              </m:r>
+            </m:sub>
+          </m:sSub>
+          <m:r>
+            <m:t xml:space="preserve">=</m:t>
+          </m:r>
+          <m:r>
+            <m:t xml:space="preserve">−</m:t>
+          </m:r>
+          <m:sSup>
+            <m:e>
+              <m:r>
+                <m:t xml:space="preserve">j</m:t>
+              </m:r>
+            </m:e>
+            <m:sup>
+              <m:r>
+                <m:t xml:space="preserve">μ</m:t>
+              </m:r>
+            </m:sup>
+          </m:sSup>
+          <m:sSub>
+            <m:e>
+              <m:r>
+                <m:t xml:space="preserve">A</m:t>
+              </m:r>
+            </m:e>
+            <m:sub>
+              <m:r>
+                <m:t xml:space="preserve">μ</m:t>
+              </m:r>
+            </m:sub>
+          </m:sSub>
         </m:oMath>
       </m:oMathPara>
     </w:p>
@@ -591,7 +862,7 @@
     </w:p>
     <w:p>
       <w:pPr>
-        <w:pStyle w:val="Heading2"/>
+        <w:pStyle w:val="Heading3"/>
       </w:pPr>
       <w:r>
         <w:t>2.2 The electron</w:t>
@@ -609,9 +880,87 @@
       </w:pPr>
       <m:oMathPara>
         <m:oMath>
+          <m:sSub>
+            <m:e>
+              <m:r>
+                <m:t xml:space="preserve">ℒ</m:t>
+              </m:r>
+            </m:e>
+            <m:sub>
+              <m:r>
+                <m:t xml:space="preserve">int</m:t>
+              </m:r>
+            </m:sub>
+          </m:sSub>
           <m:r>
-            <m:t xml:space="preserve">ℒ_int = − (−e) ψ̄γ^μψ A_μ = + e ψ̄γ^μψ A_μ</m:t>
+            <m:t xml:space="preserve">=</m:t>
           </m:r>
+          <m:r>
+            <m:t xml:space="preserve">−</m:t>
+          </m:r>
+          <m:r>
+            <m:t xml:space="preserve">−</m:t>
+          </m:r>
+          <m:r>
+            <m:t xml:space="preserve">e</m:t>
+          </m:r>
+          <m:sSup>
+            <m:e>
+              <m:r>
+                <m:t xml:space="preserve">ψ̄γ</m:t>
+              </m:r>
+            </m:e>
+            <m:sup>
+              <m:r>
+                <m:t xml:space="preserve">μψ</m:t>
+              </m:r>
+            </m:sup>
+          </m:sSup>
+          <m:sSub>
+            <m:e>
+              <m:r>
+                <m:t xml:space="preserve">A</m:t>
+              </m:r>
+            </m:e>
+            <m:sub>
+              <m:r>
+                <m:t xml:space="preserve">μ</m:t>
+              </m:r>
+            </m:sub>
+          </m:sSub>
+          <m:r>
+            <m:t xml:space="preserve">=</m:t>
+          </m:r>
+          <m:r>
+            <m:t xml:space="preserve">+</m:t>
+          </m:r>
+          <m:r>
+            <m:t xml:space="preserve">e</m:t>
+          </m:r>
+          <m:sSup>
+            <m:e>
+              <m:r>
+                <m:t xml:space="preserve">ψ̄γ</m:t>
+              </m:r>
+            </m:e>
+            <m:sup>
+              <m:r>
+                <m:t xml:space="preserve">μψ</m:t>
+              </m:r>
+            </m:sup>
+          </m:sSup>
+          <m:sSub>
+            <m:e>
+              <m:r>
+                <m:t xml:space="preserve">A</m:t>
+              </m:r>
+            </m:e>
+            <m:sub>
+              <m:r>
+                <m:t xml:space="preserve">μ</m:t>
+              </m:r>
+            </m:sub>
+          </m:sSub>
         </m:oMath>
       </m:oMathPara>
     </w:p>
@@ -627,9 +976,86 @@
       </w:pPr>
       <m:oMathPara>
         <m:oMath>
+          <m:sSub>
+            <m:e>
+              <m:r>
+                <m:t xml:space="preserve">ℒ</m:t>
+              </m:r>
+            </m:e>
+            <m:sub>
+              <m:r>
+                <m:t xml:space="preserve">QED</m:t>
+              </m:r>
+              <m:r>
+                <m:t xml:space="preserve">,</m:t>
+              </m:r>
+              <m:r>
+                <m:t xml:space="preserve">matter</m:t>
+              </m:r>
+            </m:sub>
+          </m:sSub>
           <m:r>
-            <m:t xml:space="preserve">ℒ_(QED, matter) = ψ̄(iγ^μ∂_μ − m)ψ + e ψ̄γ^μψ A_μ</m:t>
+            <m:t xml:space="preserve">=</m:t>
           </m:r>
+          <m:r>
+            <m:t xml:space="preserve">ψ̄</m:t>
+          </m:r>
+          <m:sSubSup>
+            <m:e>
+              <m:r>
+                <m:t xml:space="preserve">iγ</m:t>
+              </m:r>
+            </m:e>
+            <m:sub>
+              <m:r>
+                <m:t xml:space="preserve">μ</m:t>
+              </m:r>
+            </m:sub>
+            <m:sup>
+              <m:r>
+                <m:t xml:space="preserve">μ∂</m:t>
+              </m:r>
+            </m:sup>
+          </m:sSubSup>
+          <m:r>
+            <m:t xml:space="preserve">−</m:t>
+          </m:r>
+          <m:r>
+            <m:t xml:space="preserve">m</m:t>
+          </m:r>
+          <m:r>
+            <m:t xml:space="preserve">ψ</m:t>
+          </m:r>
+          <m:r>
+            <m:t xml:space="preserve">+</m:t>
+          </m:r>
+          <m:r>
+            <m:t xml:space="preserve">e</m:t>
+          </m:r>
+          <m:sSup>
+            <m:e>
+              <m:r>
+                <m:t xml:space="preserve">ψ̄γ</m:t>
+              </m:r>
+            </m:e>
+            <m:sup>
+              <m:r>
+                <m:t xml:space="preserve">μψ</m:t>
+              </m:r>
+            </m:sup>
+          </m:sSup>
+          <m:sSub>
+            <m:e>
+              <m:r>
+                <m:t xml:space="preserve">A</m:t>
+              </m:r>
+            </m:e>
+            <m:sub>
+              <m:r>
+                <m:t xml:space="preserve">μ</m:t>
+              </m:r>
+            </m:sub>
+          </m:sSub>
         </m:oMath>
       </m:oMathPara>
     </w:p>
@@ -639,10 +1065,11 @@
       </w:r>
     </w:p>
     <w:p>
-      <w:pPr>
-        <w:pStyle w:val="Heading3"/>
-      </w:pPr>
       <w:r>
+        <w:rPr>
+          <w:b/>
+          <w:i/>
+        </w:rPr>
         <w:t>Worked example 2</w:t>
       </w:r>
     </w:p>
@@ -653,7 +1080,7 @@
     </w:p>
     <w:p>
       <w:pPr>
-        <w:pStyle w:val="Heading1"/>
+        <w:pStyle w:val="Heading2"/>
       </w:pPr>
       <w:r>
         <w:t>3 Three derivations, one coupling</w:t>
@@ -661,7 +1088,7 @@
     </w:p>
     <w:p>
       <w:pPr>
-        <w:pStyle w:val="Heading2"/>
+        <w:pStyle w:val="Heading3"/>
       </w:pPr>
       <w:r>
         <w:t>3.1 The classical point particle</w:t>
@@ -674,7 +1101,7 @@
     </w:p>
     <w:p>
       <w:pPr>
-        <w:pStyle w:val="Heading2"/>
+        <w:pStyle w:val="Heading3"/>
       </w:pPr>
       <w:r>
         <w:t>3.2 The classical field with a source</w:t>
@@ -687,7 +1114,7 @@
     </w:p>
     <w:p>
       <w:pPr>
-        <w:pStyle w:val="Heading2"/>
+        <w:pStyle w:val="Heading3"/>
       </w:pPr>
       <w:r>
         <w:t>3.3 The field-theoretic derivation</w:t>
@@ -699,10 +1126,11 @@
       </w:r>
     </w:p>
     <w:p>
-      <w:pPr>
-        <w:pStyle w:val="Heading3"/>
-      </w:pPr>
       <w:r>
+        <w:rPr>
+          <w:b/>
+          <w:i/>
+        </w:rPr>
         <w:t>Worked example 3</w:t>
       </w:r>
     </w:p>
@@ -713,7 +1141,7 @@
     </w:p>
     <w:p>
       <w:pPr>
-        <w:pStyle w:val="Heading1"/>
+        <w:pStyle w:val="Heading2"/>
       </w:pPr>
       <w:r>
         <w:t>4 The interacting Dirac Hamiltonian</w:t>
@@ -721,7 +1149,7 @@
     </w:p>
     <w:p>
       <w:pPr>
-        <w:pStyle w:val="Heading2"/>
+        <w:pStyle w:val="Heading3"/>
       </w:pPr>
       <w:r>
         <w:t>4.1 From the covariant equation to minimal coupling</w:t>
@@ -739,9 +1167,72 @@
       </w:pPr>
       <m:oMathPara>
         <m:oMath>
+          <m:sSub>
+            <m:e>
+              <m:r>
+                <m:t xml:space="preserve">i∂</m:t>
+              </m:r>
+            </m:e>
+            <m:sub>
+              <m:r>
+                <m:t xml:space="preserve">tψ</m:t>
+              </m:r>
+            </m:sub>
+          </m:sSub>
           <m:r>
-            <m:t xml:space="preserve">i∂_tψ = [ α·(p̂ − qA) + βm + qφ ] ψ = h_Dψ</m:t>
+            <m:t xml:space="preserve">=</m:t>
           </m:r>
+          <m:r>
+            <m:t xml:space="preserve">[</m:t>
+          </m:r>
+          <m:r>
+            <m:t xml:space="preserve">α</m:t>
+          </m:r>
+          <m:r>
+            <m:t xml:space="preserve">·</m:t>
+          </m:r>
+          <m:r>
+            <m:t xml:space="preserve">p̂</m:t>
+          </m:r>
+          <m:r>
+            <m:t xml:space="preserve">−</m:t>
+          </m:r>
+          <m:r>
+            <m:t xml:space="preserve">qA</m:t>
+          </m:r>
+          <m:r>
+            <m:t xml:space="preserve">+</m:t>
+          </m:r>
+          <m:r>
+            <m:t xml:space="preserve">βm</m:t>
+          </m:r>
+          <m:r>
+            <m:t xml:space="preserve">+</m:t>
+          </m:r>
+          <m:r>
+            <m:t xml:space="preserve">qφ</m:t>
+          </m:r>
+          <m:r>
+            <m:t xml:space="preserve">]</m:t>
+          </m:r>
+          <m:r>
+            <m:t xml:space="preserve">ψ</m:t>
+          </m:r>
+          <m:r>
+            <m:t xml:space="preserve">=</m:t>
+          </m:r>
+          <m:sSub>
+            <m:e>
+              <m:r>
+                <m:t xml:space="preserve">h</m:t>
+              </m:r>
+            </m:e>
+            <m:sub>
+              <m:r>
+                <m:t xml:space="preserve">Dψ</m:t>
+              </m:r>
+            </m:sub>
+          </m:sSub>
         </m:oMath>
       </m:oMathPara>
     </w:p>
@@ -751,10 +1242,11 @@
       </w:r>
     </w:p>
     <w:p>
-      <w:pPr>
-        <w:pStyle w:val="Heading3"/>
-      </w:pPr>
       <w:r>
+        <w:rPr>
+          <w:b/>
+          <w:i/>
+        </w:rPr>
         <w:t>Worked example 4</w:t>
       </w:r>
     </w:p>
@@ -765,7 +1257,7 @@
     </w:p>
     <w:p>
       <w:pPr>
-        <w:pStyle w:val="Heading2"/>
+        <w:pStyle w:val="Heading3"/>
       </w:pPr>
       <w:r>
         <w:t>4.2 A preview: the electron's magnetic moment</w:t>
@@ -778,7 +1270,7 @@
     </w:p>
     <w:p>
       <w:pPr>
-        <w:pStyle w:val="Heading1"/>
+        <w:pStyle w:val="Heading2"/>
       </w:pPr>
       <w:r>
         <w:t>5 What is still missing</w:t>
@@ -786,7 +1278,7 @@
     </w:p>
     <w:p>
       <w:pPr>
-        <w:pStyle w:val="Heading2"/>
+        <w:pStyle w:val="Heading3"/>
       </w:pPr>
       <w:r>
         <w:t>5.1 A_μ as an external field, so far</w:t>
@@ -799,7 +1291,7 @@
     </w:p>
     <w:p>
       <w:pPr>
-        <w:pStyle w:val="Heading2"/>
+        <w:pStyle w:val="Heading3"/>
       </w:pPr>
       <w:r>
         <w:t>5.2 What Lesson 41 adds</w:t>
@@ -811,10 +1303,11 @@
       </w:r>
     </w:p>
     <w:p>
-      <w:pPr>
-        <w:pStyle w:val="Heading3"/>
-      </w:pPr>
       <w:r>
+        <w:rPr>
+          <w:b/>
+          <w:i/>
+        </w:rPr>
         <w:t>Worked example 5</w:t>
       </w:r>
     </w:p>
@@ -825,7 +1318,7 @@
     </w:p>
     <w:p>
       <w:pPr>
-        <w:pStyle w:val="Heading1"/>
+        <w:pStyle w:val="Heading2"/>
       </w:pPr>
       <w:r>
         <w:t>6 Connections to QED</w:t>
@@ -1082,7 +1575,7 @@
     </w:p>
     <w:p>
       <w:pPr>
-        <w:pStyle w:val="Heading1"/>
+        <w:pStyle w:val="Heading2"/>
       </w:pPr>
       <w:r>
         <w:t>7 Summary</w:t>
@@ -1186,7 +1679,7 @@
     </w:p>
     <w:p>
       <w:pPr>
-        <w:pStyle w:val="Heading1"/>
+        <w:pStyle w:val="Heading2"/>
       </w:pPr>
       <w:r>
         <w:t>Exercises</w:t>
@@ -1846,7 +2339,7 @@
     </w:tbl>
     <w:p>
       <w:pPr>
-        <w:pStyle w:val="Heading1"/>
+        <w:pStyle w:val="Heading2"/>
       </w:pPr>
       <w:r>
         <w:t>Solutions</w:t>
@@ -2078,7 +2571,7 @@
     </w:p>
     <w:p>
       <w:pPr>
-        <w:pStyle w:val="Heading1"/>
+        <w:pStyle w:val="Heading2"/>
       </w:pPr>
       <w:r>
         <w:t>Mastery checklist</w:t>
@@ -2150,7 +2643,7 @@
     </w:p>
     <w:p>
       <w:pPr>
-        <w:pStyle w:val="Heading1"/>
+        <w:pStyle w:val="Heading2"/>
       </w:pPr>
       <w:r>
         <w:t>Next lesson</w:t>
@@ -2636,14 +3129,15 @@
       <w:keepNext/>
       <w:keepLines/>
       <w:spacing w:before="280" w:after="140"/>
+      <w:jc w:val="center"/>
       <w:outlineLvl w:val="0"/>
     </w:pPr>
     <w:rPr>
-      <w:rFonts w:asciiTheme="majorHAnsi" w:eastAsiaTheme="majorEastAsia" w:hAnsiTheme="majorHAnsi" w:cstheme="majorBidi" w:ascii="Aptos Display" w:hAnsi="Aptos Display"/>
+      <w:rFonts w:asciiTheme="majorHAnsi" w:eastAsiaTheme="majorEastAsia" w:hAnsiTheme="majorHAnsi" w:cstheme="majorBidi" w:ascii="Amazon Ember" w:hAnsi="Amazon Ember" w:eastAsia="Amazon Ember" w:cs="Amazon Ember"/>
       <w:b/>
       <w:bCs/>
-      <w:color w:val="000000"/>
-      <w:sz w:val="40"/>
+      <w:color w:val="0000FF"/>
+      <w:sz w:val="36"/>
       <w:szCs w:val="28"/>
     </w:rPr>
   </w:style>
@@ -2660,14 +3154,15 @@
       <w:keepNext/>
       <w:keepLines/>
       <w:spacing w:before="280" w:after="140"/>
+      <w:jc w:val="center"/>
       <w:outlineLvl w:val="1"/>
     </w:pPr>
     <w:rPr>
-      <w:rFonts w:asciiTheme="majorHAnsi" w:eastAsiaTheme="majorEastAsia" w:hAnsiTheme="majorHAnsi" w:cstheme="majorBidi" w:ascii="Aptos Display" w:hAnsi="Aptos Display"/>
+      <w:rFonts w:asciiTheme="majorHAnsi" w:eastAsiaTheme="majorEastAsia" w:hAnsiTheme="majorHAnsi" w:cstheme="majorBidi" w:ascii="Amazon Ember" w:hAnsi="Amazon Ember" w:eastAsia="Amazon Ember" w:cs="Amazon Ember"/>
       <w:b/>
       <w:bCs/>
-      <w:color w:val="000000"/>
-      <w:sz w:val="30"/>
+      <w:color w:val="0000FF"/>
+      <w:sz w:val="32"/>
       <w:szCs w:val="26"/>
     </w:rPr>
   </w:style>
@@ -2684,14 +3179,15 @@
       <w:keepNext/>
       <w:keepLines/>
       <w:spacing w:before="280" w:after="140"/>
+      <w:jc w:val="center"/>
       <w:outlineLvl w:val="2"/>
     </w:pPr>
     <w:rPr>
-      <w:rFonts w:asciiTheme="majorHAnsi" w:eastAsiaTheme="majorEastAsia" w:hAnsiTheme="majorHAnsi" w:cstheme="majorBidi" w:ascii="Aptos Display" w:hAnsi="Aptos Display"/>
+      <w:rFonts w:asciiTheme="majorHAnsi" w:eastAsiaTheme="majorEastAsia" w:hAnsiTheme="majorHAnsi" w:cstheme="majorBidi" w:ascii="Amazon Ember" w:hAnsi="Amazon Ember" w:eastAsia="Amazon Ember" w:cs="Amazon Ember"/>
       <w:b/>
       <w:bCs/>
-      <w:color w:val="000000"/>
-      <w:sz w:val="24"/>
+      <w:color w:val="0000FF"/>
+      <w:sz w:val="28"/>
     </w:rPr>
   </w:style>
   <w:style w:type="paragraph" w:styleId="Heading4">
@@ -2927,11 +3423,12 @@
       </w:pBdr>
       <w:spacing w:after="140" w:line="240" w:lineRule="auto" w:before="0"/>
       <w:contextualSpacing/>
+      <w:jc w:val="center"/>
     </w:pPr>
     <w:rPr>
-      <w:rFonts w:asciiTheme="majorHAnsi" w:eastAsiaTheme="majorEastAsia" w:hAnsiTheme="majorHAnsi" w:cstheme="majorBidi" w:ascii="Aptos Display" w:hAnsi="Aptos Display"/>
+      <w:rFonts w:asciiTheme="majorHAnsi" w:eastAsiaTheme="majorEastAsia" w:hAnsiTheme="majorHAnsi" w:cstheme="majorBidi" w:ascii="Amazon Ember" w:hAnsi="Amazon Ember" w:eastAsia="Amazon Ember" w:cs="Amazon Ember"/>
       <w:b/>
-      <w:color w:val="000000"/>
+      <w:color w:val="0000FF"/>
       <w:spacing w:val="5"/>
       <w:kern w:val="28"/>
       <w:sz w:val="60"/>
@@ -2966,13 +3463,14 @@
         <w:ilvl w:val="1"/>
       </w:numPr>
       <w:spacing w:before="280" w:after="140"/>
+      <w:jc w:val="center"/>
     </w:pPr>
     <w:rPr>
-      <w:rFonts w:asciiTheme="majorHAnsi" w:eastAsiaTheme="majorEastAsia" w:hAnsiTheme="majorHAnsi" w:cstheme="majorBidi" w:ascii="Aptos Display" w:hAnsi="Aptos Display"/>
-      <w:b w:val="0"/>
+      <w:rFonts w:asciiTheme="majorHAnsi" w:eastAsiaTheme="majorEastAsia" w:hAnsiTheme="majorHAnsi" w:cstheme="majorBidi" w:ascii="Amazon Ember" w:hAnsi="Amazon Ember" w:eastAsia="Amazon Ember" w:cs="Amazon Ember"/>
+      <w:b/>
       <w:i/>
       <w:iCs/>
-      <w:color w:val="000000"/>
+      <w:color w:val="0000FF"/>
       <w:spacing w:val="15"/>
       <w:sz w:val="28"/>
       <w:szCs w:val="24"/>

</xml_diff>